<commit_message>
Auto commit (2026-08-12 17:06) — 2 changes
Claude Code 세션 종료 시 자동 커밋.

Co-Authored-By: Claude <noreply@anthropic.com>
Claude-Session: https://claude.ai/code/8a9b739c-5a41-4558-9450-4ca60dbe3392
</commit_message>
<xml_diff>
--- a/projects/17_son_of_the_lamp/거지 알라딘과 요술램프_무료회차 1-8화_자연스러운 한국어본_v1.docx
+++ b/projects/17_son_of_the_lamp/거지 알라딘과 요술램프_무료회차 1-8화_자연스러운 한국어본_v1.docx
@@ -106,7 +106,7 @@
           <w:color w:val="444444"/>
           <w:sz w:val="21"/>
         </w:rPr>
-        <w:t>△ 시체 산 위에 거대한 이족 수장이 서 있다. 온몸에 검은 기운을 두르고, 두 손으로 든 거대한 도끼를 포효와 함께 내리찍는다.</w:t>
+        <w:t>△ 시체 산 위에 인간이 아닌 거대한 적장이 서 있다. 온몸에 검은 기운을 두르고, 두 손으로 든 거대한 도끼를 포효와 함께 내리찍는다.</w:t>
       </w:r>
     </w:p>
     <w:p>
@@ -229,7 +229,7 @@
           <w:color w:val="444444"/>
           <w:sz w:val="21"/>
         </w:rPr>
-        <w:t>△ 이족 수장도, 뒤에 끝없이 늘어선 검은 갑주의 대군도 통째로 가루가 된다.</w:t>
+        <w:t>△ 적장도, 뒤에 끝없이 늘어선 검은 갑주의 대군도 통째로 가루가 된다.</w:t>
       </w:r>
     </w:p>
     <w:p>

</xml_diff>

<commit_message>
Auto commit (2026-08-12 17:18) — 6 changes
Claude Code 세션 종료 시 자동 커밋.

Co-Authored-By: Claude <noreply@anthropic.com>
</commit_message>
<xml_diff>
--- a/projects/17_son_of_the_lamp/거지 알라딘과 요술램프_무료회차 1-8화_자연스러운 한국어본_v1.docx
+++ b/projects/17_son_of_the_lamp/거지 알라딘과 요술램프_무료회차 1-8화_자연스러운 한국어본_v1.docx
@@ -6829,22 +6829,7 @@
           <w:color w:val="1A1A1A"/>
           <w:sz w:val="23"/>
         </w:rPr>
-        <w:t>(이를 갈며): 총독 각하! 소라야 그 천한 년이 사람들 앞에서 저를 모욕했습니다. 그 빌어먹을 호위 놈까지요!</w:t>
-      </w:r>
-    </w:p>
-    <w:p>
-      <w:pPr>
-        <w:keepNext w:val="0"/>
-        <w:spacing w:after="100" w:before="0" w:line="322" w:lineRule="auto"/>
-      </w:pPr>
-      <w:r>
-        <w:rPr>
-          <w:rFonts w:ascii="맑은 고딕" w:hAnsi="맑은 고딕" w:eastAsia="맑은 고딕"/>
-          <w:b w:val="0"/>
-          <w:color w:val="444444"/>
-          <w:sz w:val="21"/>
-        </w:rPr>
-        <w:t>반드시 이 분을 풀어주셔야 합니다!</w:t>
+        <w:t>(이를 갈며): 총독 각하! 소라야 그 천한 년이 사람들 앞에서 저를 모욕했습니다. 그 빌어먹을 호위 놈까지요! 반드시 이 분을 풀어주셔야 합니다!</w:t>
       </w:r>
     </w:p>
     <w:p>
@@ -7968,23 +7953,14 @@
     <w:p>
       <w:pPr>
         <w:keepNext w:val="0"/>
-        <w:spacing w:after="100" w:before="0" w:line="322" w:lineRule="auto"/>
-      </w:pPr>
-      <w:r>
-        <w:rPr>
-          <w:rFonts w:ascii="맑은 고딕" w:hAnsi="맑은 고딕" w:eastAsia="맑은 고딕"/>
-          <w:b w:val="0"/>
-          <w:color w:val="444444"/>
-          <w:sz w:val="21"/>
-        </w:rPr>
-        <w:t xml:space="preserve">△ </w:t>
-      </w:r>
+        <w:spacing w:after="140" w:before="100" w:line="322" w:lineRule="auto"/>
+      </w:pPr>
       <w:r>
         <w:rPr>
           <w:rFonts w:ascii="맑은 고딕" w:hAnsi="맑은 고딕" w:eastAsia="맑은 고딕"/>
           <w:b/>
           <w:color w:val="8A5A10"/>
-          <w:sz w:val="21"/>
+          <w:sz w:val="23"/>
         </w:rPr>
         <w:t>알라딘 VO</w:t>
       </w:r>
@@ -7992,8 +7968,8 @@
         <w:rPr>
           <w:rFonts w:ascii="맑은 고딕" w:hAnsi="맑은 고딕" w:eastAsia="맑은 고딕"/>
           <w:b w:val="0"/>
-          <w:color w:val="444444"/>
-          <w:sz w:val="21"/>
+          <w:color w:val="1A1A1A"/>
+          <w:sz w:val="23"/>
         </w:rPr>
         <w:t>: 내가 지키는 사람을 건드리겠다고? 너, 나한테 물어는 봤나?</w:t>
       </w:r>

</xml_diff>